<commit_message>
fixes to excel workbooks
</commit_message>
<xml_diff>
--- a/reports/SignalStack_Report_2026-W14.docx
+++ b/reports/SignalStack_Report_2026-W14.docx
@@ -911,6 +911,27 @@
           <w:color w:val="1A3A5C"/>
           <w:sz w:val="20"/>
         </w:rPr>
+        <w:t xml:space="preserve">Ensemble Forecast  </w:t>
+      </w:r>
+      <w:r>
+        <w:rPr>
+          <w:color w:val="000000"/>
+          <w:sz w:val="20"/>
+        </w:rPr>
+        <w:t>A blending technique that combines SARIMA with a Weighted Moving Average (WMA) to stabilize volatile signals. The SARIMA component captures seasonality/trend while the WMA anchors projections to recent observed levels.</w:t>
+      </w:r>
+    </w:p>
+    <w:p>
+      <w:pPr>
+        <w:spacing w:before="80" w:after="80"/>
+        <w:ind w:left="288"/>
+      </w:pPr>
+      <w:r>
+        <w:rPr>
+          <w:b/>
+          <w:color w:val="1A3A5C"/>
+          <w:sz w:val="20"/>
+        </w:rPr>
         <w:t xml:space="preserve">Cross-Validation (CV)  </w:t>
       </w:r>
       <w:r>
@@ -1205,6 +1226,27 @@
           <w:color w:val="1A3A5C"/>
           <w:sz w:val="20"/>
         </w:rPr>
+        <w:t xml:space="preserve">Signal Profile  </w:t>
+      </w:r>
+      <w:r>
+        <w:rPr>
+          <w:color w:val="000000"/>
+          <w:sz w:val="20"/>
+        </w:rPr>
+        <w:t>Business context block in reports (currently Sales) that summarizes transaction volume, customer count, and revenue concentration so forecast accuracy is interpreted against data structure.</w:t>
+      </w:r>
+    </w:p>
+    <w:p>
+      <w:pPr>
+        <w:spacing w:before="80" w:after="80"/>
+        <w:ind w:left="288"/>
+      </w:pPr>
+      <w:r>
+        <w:rPr>
+          <w:b/>
+          <w:color w:val="1A3A5C"/>
+          <w:sz w:val="20"/>
+        </w:rPr>
         <w:t xml:space="preserve">Skip-Search  </w:t>
       </w:r>
       <w:r>
@@ -1339,48 +1381,6 @@
           <w:sz w:val="20"/>
         </w:rPr>
         <w:t>Mean Absolute Percentage Error — forecast accuracy expressed as a percentage. 5% MAPE means the model is off by 5% on average. Under 10% is considered good for business forecasting.</w:t>
-      </w:r>
-    </w:p>
-    <w:p>
-      <w:pPr>
-        <w:spacing w:before="80" w:after="80"/>
-        <w:ind w:left="288"/>
-      </w:pPr>
-      <w:r>
-        <w:rPr>
-          <w:b/>
-          <w:color w:val="1A3A5C"/>
-          <w:sz w:val="20"/>
-        </w:rPr>
-        <w:t xml:space="preserve">Ensemble Forecast  </w:t>
-      </w:r>
-      <w:r>
-        <w:rPr>
-          <w:color w:val="000000"/>
-          <w:sz w:val="20"/>
-        </w:rPr>
-        <w:t>A blending technique that combines SARIMA with a Weighted Moving Average (WMA) to stabilize volatile signals. The SARIMA component captures seasonality and trend; the WMA anchors the forecast to recent observed levels. Used for pipeline value and similar high-variance signals.</w:t>
-      </w:r>
-    </w:p>
-    <w:p>
-      <w:pPr>
-        <w:spacing w:before="80" w:after="80"/>
-        <w:ind w:left="288"/>
-      </w:pPr>
-      <w:r>
-        <w:rPr>
-          <w:b/>
-          <w:color w:val="1A3A5C"/>
-          <w:sz w:val="20"/>
-        </w:rPr>
-        <w:t xml:space="preserve">Signal Profile  </w:t>
-      </w:r>
-      <w:r>
-        <w:rPr>
-          <w:color w:val="000000"/>
-          <w:sz w:val="20"/>
-        </w:rPr>
-        <w:t>Business context about the data behind a forecast — customer count, transaction volume, revenue concentration. Explains why some signals are inherently harder to forecast than others.</w:t>
       </w:r>
     </w:p>
     <w:p>
@@ -1697,26 +1697,6 @@
           <w:sz w:val="20"/>
         </w:rPr>
         <w:t>Use for directional awareness, not precise planning. Verify actuals weekly. Flag if actual values diverge from the forecast by more than $208 for two consecutive periods.</w:t>
-      </w:r>
-    </w:p>
-    <w:p>
-      <w:pPr>
-        <w:spacing w:before="80" w:after="160"/>
-      </w:pPr>
-      <w:r>
-        <w:rPr>
-          <w:b/>
-          <w:color w:val="1A3A5C"/>
-          <w:sz w:val="20"/>
-        </w:rPr>
-        <w:t xml:space="preserve">Signal Profile: </w:t>
-      </w:r>
-      <w:r>
-        <w:rPr>
-          <w:color w:val="000000"/>
-          <w:sz w:val="20"/>
-        </w:rPr>
-        <w:t>This forecast is built from 441 historical transactions across 15 unique customers, with total tracked revenue of $790,660. The top 5 customers account for 42% of all revenue. This concentration means individual ordering patterns directly impact daily revenue variance — a structural data characteristic, not a model weakness. Accuracy will improve as customer count grows. Average transaction size is $1,793, indicating bulk/commercial purchasing patterns typical of field service operations.</w:t>
       </w:r>
     </w:p>
     <w:p>

</xml_diff>